<commit_message>
Info institucional LaHaus v2: mision, vision, historia (fundacion 2017, Global Teacher 2018), valores, alianzas internacionales sin promesa de plazas y exigencia, tomados de la presentacion de induccion
Co-Authored-By: Claude Fable 5.1 <noreply@anthropic.com>
</commit_message>
<xml_diff>
--- a/recursos/comercial/plataforma LaHaus/INFO_INSTITUCIONAL_HEIIU.docx
+++ b/recursos/comercial/plataforma LaHaus/INFO_INSTITUCIONAL_HEIIU.docx
@@ -70,6 +70,32 @@
     </w:p>
     <w:p>
       <w:pPr>
+        <w:spacing w:after="80"/>
+      </w:pPr>
+      <w:r>
+        <w:rPr>
+          <w:b w:val="0"/>
+          <w:i w:val="0"/>
+          <w:sz w:val="21"/>
+        </w:rPr>
+        <w:t>Nuestra historia: nacimos en 2017 como una fundación en Barro Blanco, Piedecuesta, con un deseo genuino: que las personas con menos privilegios tuvieran las oportunidades que otros reciben casi por defecto. Para poder sostener el programa, en octubre de 2018 adquirimos Global Teacher S.A.S., institución con licencia desde 2012, y desde entonces operamos como academia formal sin perder el propósito con el que empezamos. En el camino diseñamos una metodología propia basada en la repetición, el trabajo en pares y el apoyo entre estudiantes.</w:t>
+      </w:r>
+    </w:p>
+    <w:p>
+      <w:pPr>
+        <w:spacing w:after="80"/>
+      </w:pPr>
+      <w:r>
+        <w:rPr>
+          <w:b w:val="0"/>
+          <w:i/>
+          <w:sz w:val="21"/>
+        </w:rPr>
+        <w:t>No enseñamos inglés, transformamos futuros: pertenecer a la academia significa que cada persona que se conecta con nosotros encuentra una mano para cumplir sus metas.</w:t>
+      </w:r>
+    </w:p>
+    <w:p>
+      <w:pPr>
         <w:spacing w:after="40"/>
         <w:ind w:left="283"/>
       </w:pPr>
@@ -115,7 +141,7 @@
           <w:i/>
           <w:sz w:val="21"/>
         </w:rPr>
-        <w:t>Que ningún colombiano con potencial pierda una oportunidad — laboral, de estudio, de viaje o personal — por no hablar inglés.</w:t>
+        <w:t>Conectar a nuestros estudiantes con oportunidades laborales a nivel nacional e internacional por medio de la enseñanza del inglés como segundo idioma, y mejorar e impactar sus vidas.</w:t>
       </w:r>
     </w:p>
     <w:p>
@@ -141,7 +167,104 @@
           <w:i/>
           <w:sz w:val="21"/>
         </w:rPr>
-        <w:t>Ser la academia de inglés de referencia en Santander por una razón medible: que nuestros estudiantes demuestren lo que aprendieron, con certificados verificables y resultados en su vida real — un ascenso, un viaje, un negocio, una entrevista. Queremos ser la institución que firma por sus resultados, no la que promete.</w:t>
+        <w:t>Expandirnos a nivel nacional con más programas especializados, manteniendo lo que nos define: resultados medibles y un compromiso escrito con cada estudiante.</w:t>
+      </w:r>
+    </w:p>
+    <w:p>
+      <w:pPr>
+        <w:spacing w:before="200" w:after="60"/>
+      </w:pPr>
+      <w:r>
+        <w:rPr>
+          <w:b/>
+          <w:color w:val="E54C09"/>
+          <w:sz w:val="25"/>
+        </w:rPr>
+        <w:t>3B. VALORES</w:t>
+      </w:r>
+    </w:p>
+    <w:p>
+      <w:pPr>
+        <w:spacing w:after="40"/>
+        <w:ind w:left="283"/>
+      </w:pPr>
+      <w:r>
+        <w:rPr>
+          <w:sz w:val="21"/>
+        </w:rPr>
+        <w:t>· Honestidad.</w:t>
+      </w:r>
+    </w:p>
+    <w:p>
+      <w:pPr>
+        <w:spacing w:after="40"/>
+        <w:ind w:left="283"/>
+      </w:pPr>
+      <w:r>
+        <w:rPr>
+          <w:sz w:val="21"/>
+        </w:rPr>
+        <w:t>· Respeto por el cliente y por su inversión.</w:t>
+      </w:r>
+    </w:p>
+    <w:p>
+      <w:pPr>
+        <w:spacing w:after="40"/>
+        <w:ind w:left="283"/>
+      </w:pPr>
+      <w:r>
+        <w:rPr>
+          <w:sz w:val="21"/>
+        </w:rPr>
+        <w:t>· Responsabilidad y compromiso con la calidad y la excelencia.</w:t>
+      </w:r>
+    </w:p>
+    <w:p>
+      <w:pPr>
+        <w:spacing w:after="40"/>
+        <w:ind w:left="283"/>
+      </w:pPr>
+      <w:r>
+        <w:rPr>
+          <w:sz w:val="21"/>
+        </w:rPr>
+        <w:t>· Integridad: cumplimos lo que prometemos.</w:t>
+      </w:r>
+    </w:p>
+    <w:p>
+      <w:pPr>
+        <w:spacing w:after="40"/>
+        <w:ind w:left="283"/>
+      </w:pPr>
+      <w:r>
+        <w:rPr>
+          <w:sz w:val="21"/>
+        </w:rPr>
+        <w:t>· Responsabilidad social: queremos ayudar de verdad, y vemos el futuro de nuestros estudiantes reflejado en nuestro trabajo.</w:t>
+      </w:r>
+    </w:p>
+    <w:p>
+      <w:pPr>
+        <w:spacing w:after="40"/>
+        <w:ind w:left="283"/>
+      </w:pPr>
+      <w:r>
+        <w:rPr>
+          <w:sz w:val="21"/>
+        </w:rPr>
+        <w:t>· Inteligencia emocional: somos profesionales y adultos.</w:t>
+      </w:r>
+    </w:p>
+    <w:p>
+      <w:pPr>
+        <w:spacing w:after="40"/>
+        <w:ind w:left="283"/>
+      </w:pPr>
+      <w:r>
+        <w:rPr>
+          <w:sz w:val="21"/>
+        </w:rPr>
+        <w:t>· Pasión.</w:t>
       </w:r>
     </w:p>
     <w:p>
@@ -166,7 +289,7 @@
         <w:rPr>
           <w:sz w:val="21"/>
         </w:rPr>
-        <w:t>· Licencia de funcionamiento desde 2012: 14 años formando estudiantes en Bucaramanga.</w:t>
+        <w:t>· Equipo formando estudiantes desde 2017; institución con licencia de funcionamiento desde 2012.</w:t>
       </w:r>
     </w:p>
     <w:p>
@@ -203,6 +326,18 @@
           <w:sz w:val="21"/>
         </w:rPr>
         <w:t>· Alianzas con empresas de la región para la formación de sus equipos, y programa para colegios.</w:t>
+      </w:r>
+    </w:p>
+    <w:p>
+      <w:pPr>
+        <w:spacing w:after="40"/>
+        <w:ind w:left="283"/>
+      </w:pPr>
+      <w:r>
+        <w:rPr>
+          <w:sz w:val="21"/>
+        </w:rPr>
+        <w:t>· Lo que nos diferencia: buscamos activamente conectar a nuestros estudiantes con oportunidades que les cambien los ingresos y la vida. Tenemos alianzas con programas internacionales como Au Pair, Work and Travel y campamentos de verano en Estados Unidos, además de bolsas de empleo en el exterior. El inglés es el requisito de entrada a todos ellos; la academia orienta y conecta, no garantiza plazas.</w:t>
       </w:r>
     </w:p>
     <w:p>
@@ -427,6 +562,19 @@
           <w:sz w:val="21"/>
         </w:rPr>
         <w:t>La garantía es un trato en dos direcciones: la academia pone el método, el profesor y el respaldo; el estudiante pone el trabajo — asistencia, tareas y su práctica diaria. Por eso no prometemos que sea fácil ni rápido: prometemos que funciona si se hace el trabajo.</w:t>
+      </w:r>
+    </w:p>
+    <w:p>
+      <w:pPr>
+        <w:spacing w:after="80"/>
+      </w:pPr>
+      <w:r>
+        <w:rPr>
+          <w:b w:val="0"/>
+          <w:i w:val="0"/>
+          <w:sz w:val="21"/>
+        </w:rPr>
+        <w:t>Nuestra exigencia: somos estrictos en asistencia y puntualidad. El resultado se logra en equipo, en clase y en casa, y por eso el listening en casa es fundamental. El enfoque es conversacional, pero la gramática no se deja de lado porque es la base para comunicarse bien. Aprender un idioma exige repetir mil y una veces, y el estudiante que lo entiende desde el inicio es el que llega.</w:t>
       </w:r>
     </w:p>
     <w:p>

</xml_diff>

<commit_message>
Info institucional LaHaus alineada con la base de conocimiento enviada: sesion de ubicacion (prueba + entrevista), jornadas completas, edades y regla de Cajasan
Co-Authored-By: Claude Fable 5.1 <noreply@anthropic.com>
</commit_message>
<xml_diff>
--- a/recursos/comercial/plataforma LaHaus/INFO_INSTITUCIONAL_HEIIU.docx
+++ b/recursos/comercial/plataforma LaHaus/INFO_INSTITUCIONAL_HEIIU.docx
@@ -313,7 +313,7 @@
         <w:rPr>
           <w:sz w:val="21"/>
         </w:rPr>
-        <w:t>· Convenio con Cajasan: la única academia de inglés de la ciudad con este convenio para sus afiliados.</w:t>
+        <w:t>· Convenio con Cajasan: la única academia de inglés de la ciudad con este convenio para sus afiliados. Las condiciones del convenio se explican en la asesoría personalizada.</w:t>
       </w:r>
     </w:p>
     <w:p>
@@ -411,7 +411,7 @@
         <w:rPr>
           <w:sz w:val="21"/>
         </w:rPr>
-        <w:t>· Avance medido: prueba de ubicación internacional (EF SET) antes de entrar, evaluaciones por nivel, examen final aplicado por un evaluador externo, y certificado oficial por cada nivel aprobado.</w:t>
+        <w:t>· Avance medido: sesión de ubicación gratuita antes de decidir (prueba en línea EF SET + entrevista oral corta; el nivel lo define la academia), evaluaciones por nivel, examen final aplicado por un evaluador externo, y certificado oficial por cada nivel aprobado.</w:t>
       </w:r>
     </w:p>
     <w:p>
@@ -448,7 +448,20 @@
           <w:i w:val="0"/>
           <w:sz w:val="21"/>
         </w:rPr>
-        <w:t>Jornadas: mañana (8:00 a 12:00), noche (6:30 a 8:30 PM) y modalidad sabatina (8:00 AM a 12:00 M). Formatos intensivo (10 horas por semana) y súper intensivo (20 horas por semana).</w:t>
+        <w:t>Jornadas según nivel y grupo vigente: mañana (8:00 a 12:00), tarde (2:00 a 6:00), franjas de 2 horas entre semana (por ejemplo 6:30 a 8:30 PM) y modalidad sabatina (8:00 AM a 12:00 M). Formatos intensivo (10 horas por semana) y súper intensivo (20 horas por semana). El horario exacto se confirma en la asesoría.</w:t>
+      </w:r>
+    </w:p>
+    <w:p>
+      <w:pPr>
+        <w:spacing w:after="80"/>
+      </w:pPr>
+      <w:r>
+        <w:rPr>
+          <w:b w:val="0"/>
+          <w:i w:val="0"/>
+          <w:sz w:val="21"/>
+        </w:rPr>
+        <w:t>Edades: programas entre semana desde los 17 años; modalidad sabatina desde los 12 años (el contrato del menor lo firma su acudiente).</w:t>
       </w:r>
     </w:p>
     <w:p>

</xml_diff>

<commit_message>
LaHaus: el metodo se describe como 'habla en ingles desde el primer dia, clases activas' (sin 'de pie', que no se cumple en el aula) y se menciona una vez por conversacion
Co-Authored-By: Claude Fable 5.1 <noreply@anthropic.com>
</commit_message>
<xml_diff>
--- a/recursos/comercial/plataforma LaHaus/INFO_INSTITUCIONAL_HEIIU.docx
+++ b/recursos/comercial/plataforma LaHaus/INFO_INSTITUCIONAL_HEIIU.docx
@@ -52,7 +52,7 @@
           <w:i w:val="0"/>
           <w:sz w:val="21"/>
         </w:rPr>
-        <w:t>Heiiu English Academy es la marca comercial de Global Teacher S.A.S., una institución de educación para el trabajo y el desarrollo humano con sede en Bucaramanga. Somos una academia de inglés PRESENCIAL: creemos que el inglés se entrena hablando, de pie, con un profesor al frente y un grupo pequeño alrededor.</w:t>
+        <w:t>Heiiu English Academy es la marca comercial de Global Teacher S.A.S., una institución de educación para el trabajo y el desarrollo humano con sede en Bucaramanga. Somos una academia de inglés PRESENCIAL: creemos que el inglés se entrena hablando, en clases activas, con un profesor al frente y un grupo pequeño alrededor.</w:t>
       </w:r>
     </w:p>
     <w:p>
@@ -375,7 +375,7 @@
         <w:rPr>
           <w:sz w:val="21"/>
         </w:rPr>
-        <w:t>· Clases inmersivas y presenciales: el estudiante habla de pie desde el primer día. La clase se conduce en inglés y el profesor guía, corrige y hace practicar en voz alta.</w:t>
+        <w:t>· Clases inmersivas y presenciales: el estudiante habla en inglés desde el primer día. La clase se conduce en inglés y el profesor guía, corrige y hace practicar en voz alta.</w:t>
       </w:r>
     </w:p>
     <w:p>

</xml_diff>

<commit_message>
LaHaus: modulos de graduacion (Emprendedor / Pasaporte al terminar A2) y Refuerzo PRO (al terminar B2) en la base de conocimiento, el documento de cambios y el institucional
Co-Authored-By: Claude Fable 5.1 <noreply@anthropic.com>
</commit_message>
<xml_diff>
--- a/recursos/comercial/plataforma LaHaus/INFO_INSTITUCIONAL_HEIIU.docx
+++ b/recursos/comercial/plataforma LaHaus/INFO_INSTITUCIONAL_HEIIU.docx
@@ -772,7 +772,7 @@
               <w:rPr>
                 <w:sz w:val="19"/>
               </w:rPr>
-              <w:t>Futuro, condicionales, presente perfecto, voz pasiva, comparativos, phrasal verbs. Situaciones: entrevista de trabajo, hotel, tienda, restaurante, servicio al cliente, reunión de equipo, primer día en un empleo. Cierra con la presentación oral MY LIFE (7-10 min).</w:t>
+              <w:t>Futuro, condicionales, presente perfecto, voz pasiva, comparativos, phrasal verbs. Situaciones: entrevista de trabajo, hotel, tienda, restaurante, servicio al cliente, reunión de equipo, primer día en un empleo. Cierra con la presentación oral MY LIFE (7-10 min) y, en el Arranque, con el Módulo de Graduación a elección: Emprendedor (página web publicada, pitch y primer mensaje de venta en inglés) o Pasaporte (video de presentación, hoja de vida, entrevista ensayada para Au Pair o Work &amp; Travel).</w:t>
             </w:r>
           </w:p>
         </w:tc>
@@ -876,7 +876,7 @@
               <w:rPr>
                 <w:sz w:val="19"/>
               </w:rPr>
-              <w:t>Primera mitad, vida real: restaurante, direcciones, compras, médico, arriendo, banco, aeropuerto, desacuerdos. Segunda mitad, mundo profesional: networking, CV en 3 minutos, entrevistas, reuniones, presentar una idea, cliente molesto, negociación, feedback, pitch de 90 segundos, pedir un aumento. Cierra con un simulacro de una jornada completa de trabajo en inglés.</w:t>
+              <w:t>Primera mitad, vida real: restaurante, direcciones, compras, médico, arriendo, banco, aeropuerto, desacuerdos. Segunda mitad, mundo profesional: networking, CV en 3 minutos, entrevistas, reuniones, presentar una idea, cliente molesto, negociación, feedback, pitch de 90 segundos, pedir un aumento. Cierra con un simulacro de una jornada completa de trabajo en inglés y, en el programa completo, con el Refuerzo PRO: pitch avanzado, negociación real y video del antes y después.</w:t>
             </w:r>
           </w:p>
         </w:tc>

</xml_diff>